<commit_message>
Ta Ta Ta Sahur
</commit_message>
<xml_diff>
--- a/changes.docx
+++ b/changes.docx
@@ -14,6 +14,113 @@
           <w:b/>
           <w:bCs/>
         </w:rPr>
+        <w:t>Industry evacuation (USSR/China)</w:t>
+      </w:r>
+    </w:p>
+    <w:p>
+      <w:r>
+        <w:rPr>
+          <w:b/>
+          <w:bCs/>
+        </w:rPr>
+        <w:t>The what:</w:t>
+      </w:r>
+      <w:r>
+        <w:t xml:space="preserve"> Industry evacuation model is taken from TRP as basis but modified in certain ways. The key principle is the same – several evacuation waves, each corresponding to a certain area - in each, you have to defend your industrial centers in that area for a certain time. At the end, whatever industry you still control gets evacuated, the rest remains under enemy occupation. Here are the key differences:</w:t>
+      </w:r>
+    </w:p>
+    <w:p>
+      <w:pPr>
+        <w:pStyle w:val="ListParagraph"/>
+        <w:numPr>
+          <w:ilvl w:val="0"/>
+          <w:numId w:val="8"/>
+        </w:numPr>
+      </w:pPr>
+      <w:r>
+        <w:t>Instead of 3 evacuation waves for the USSR, there are five – The Caucasus and Central regions up to Volga can also be evacuated.</w:t>
+      </w:r>
+    </w:p>
+    <w:p>
+      <w:pPr>
+        <w:pStyle w:val="ListParagraph"/>
+        <w:numPr>
+          <w:ilvl w:val="0"/>
+          <w:numId w:val="8"/>
+        </w:numPr>
+      </w:pPr>
+      <w:r>
+        <w:t>Instead of automatic evacuation with fixed dates, each evacuation wave is by player decision, and you can evacuate several areas at the same time if you can afford it.</w:t>
+      </w:r>
+    </w:p>
+    <w:p>
+      <w:pPr>
+        <w:pStyle w:val="ListParagraph"/>
+        <w:numPr>
+          <w:ilvl w:val="0"/>
+          <w:numId w:val="8"/>
+        </w:numPr>
+      </w:pPr>
+      <w:r>
+        <w:t>The locations for the evacuated industry are somewhat randomized rather than just going to predefined provinces.</w:t>
+      </w:r>
+    </w:p>
+    <w:p>
+      <w:pPr>
+        <w:pStyle w:val="ListParagraph"/>
+        <w:numPr>
+          <w:ilvl w:val="0"/>
+          <w:numId w:val="8"/>
+        </w:numPr>
+      </w:pPr>
+      <w:r>
+        <w:t>The evacuated industry does not immediately start functioning all at once, but rather slowly recovers and can take up to a month to get up and running again.</w:t>
+      </w:r>
+    </w:p>
+    <w:p>
+      <w:pPr>
+        <w:pStyle w:val="ListParagraph"/>
+        <w:numPr>
+          <w:ilvl w:val="0"/>
+          <w:numId w:val="8"/>
+        </w:numPr>
+      </w:pPr>
+      <w:r>
+        <w:t xml:space="preserve">There are costs to the evacuation – there is an upfront cost in TC, which will plummet for the duration of the evacuation, but even once it is finished, given the slow pace at which the evacuated factories come back in operation, there will be a period when your IC (and therefore TC as well) is significantly disrupted. </w:t>
+      </w:r>
+    </w:p>
+    <w:p>
+      <w:r>
+        <w:rPr>
+          <w:b/>
+          <w:bCs/>
+        </w:rPr>
+        <w:t>The why:</w:t>
+      </w:r>
+      <w:r>
+        <w:t xml:space="preserve"> I figured that more flexibility with the evacuation is more fun and more strategy. You don’t have to evacuate certain regions at all if you don’t think you’re likely to lose them, or the opposite – you don’t think you can hold them long enough for the evacuation to even be effective. On the other hand, if you order too many evacuations at once, you can cripple your TC and your fighting capacity with it. Either way, you have some control over the pace of the evacuations.</w:t>
+      </w:r>
+    </w:p>
+    <w:p>
+      <w:pPr>
+        <w:rPr>
+          <w:b/>
+          <w:bCs/>
+        </w:rPr>
+      </w:pPr>
+    </w:p>
+    <w:p>
+      <w:pPr>
+        <w:rPr>
+          <w:b/>
+          <w:bCs/>
+        </w:rPr>
+      </w:pPr>
+      <w:r>
+        <w:rPr>
+          <w:b/>
+          <w:bCs/>
+        </w:rPr>
         <w:t>War Preparedness</w:t>
       </w:r>
     </w:p>
@@ -72,16 +179,13 @@
         <w:t xml:space="preserve">hostilities actually start, </w:t>
       </w:r>
       <w:r>
-        <w:rPr>
-          <w:u w:val="single"/>
-        </w:rPr>
-        <w:t>every</w:t>
-      </w:r>
-      <w:r>
-        <w:t xml:space="preserve"> nation</w:t>
-      </w:r>
-      <w:r>
-        <w:t xml:space="preserve"> ends up </w:t>
+        <w:t>nation</w:t>
+      </w:r>
+      <w:r>
+        <w:t>s always</w:t>
+      </w:r>
+      <w:r>
+        <w:t xml:space="preserve"> end up </w:t>
       </w:r>
       <w:r>
         <w:t>discover</w:t>
@@ -90,13 +194,17 @@
         <w:t>ing</w:t>
       </w:r>
       <w:r>
-        <w:t xml:space="preserve"> that nothing actually works quite as intended. Divisions aren’t actually as well-staffed as it said in the reports, too much equipment is not actually ready for combat</w:t>
+        <w:t xml:space="preserve"> that nothing actually works quite as intended. Divisions aren’t actually as well-staffed as it said in the reports, too much equipment is not ready for combat</w:t>
       </w:r>
       <w:r>
         <w:t xml:space="preserve"> or is being used improperly,</w:t>
       </w:r>
       <w:r>
-        <w:t xml:space="preserve"> officers keep making the dumbest embarrassing mistakes, proper coordination is lacking</w:t>
+        <w:t xml:space="preserve"> officers keep making the dumbest embarrassing </w:t>
+      </w:r>
+      <w:r>
+        <w:lastRenderedPageBreak/>
+        <w:t>mistakes, proper coordination is lacking</w:t>
       </w:r>
       <w:r>
         <w:t xml:space="preserve"> and organization is inefficient</w:t>
@@ -105,7 +213,13 @@
         <w:t xml:space="preserve">, </w:t>
       </w:r>
       <w:r>
-        <w:t xml:space="preserve">logistics is dogshit, </w:t>
+        <w:t xml:space="preserve">logistics </w:t>
+      </w:r>
+      <w:r>
+        <w:t>fails in unforeseen and incomprehensible ways</w:t>
+      </w:r>
+      <w:r>
+        <w:t xml:space="preserve">, </w:t>
       </w:r>
       <w:r>
         <w:t xml:space="preserve">and many tactics just don’t work on the battlefield the same way as it </w:t>
@@ -114,7 +228,13 @@
         <w:t>was described in the field manuals</w:t>
       </w:r>
       <w:r>
-        <w:t>, etc, etc. As a result, the first few weeks of war are typically rather chaotic and full of horrible decisions.</w:t>
+        <w:t>, et</w:t>
+      </w:r>
+      <w:r>
+        <w:t>c</w:t>
+      </w:r>
+      <w:r>
+        <w:t>. As a result, the first few weeks of war are typically rather chaotic and full of horrible decisions.</w:t>
       </w:r>
       <w:r>
         <w:t xml:space="preserve"> Especially this is true for countries without a strong military tradition and without very recent/concurrent military experience. This period of initial confusion creates a window of opportunity for an aggressive and experienced country to potentially exploit and achieve </w:t>
@@ -123,7 +243,13 @@
         <w:t>the</w:t>
       </w:r>
       <w:r>
-        <w:t xml:space="preserve"> initial breakthrough, after which the question becomes whether the defending country is able to re-organize and stop the offensive, or whether the attacker can capitalize on that initial success to continue rapidly delivering blow after blow until the defend</w:t>
+        <w:t xml:space="preserve"> initial breakthrough, after which the question becomes whether the defending </w:t>
+      </w:r>
+      <w:r>
+        <w:t>side</w:t>
+      </w:r>
+      <w:r>
+        <w:t xml:space="preserve"> is able to re-organize and stop the offensive, or whether the attacker can capitalize on that initial success to continue rapidly delivering blow after blow until the defend</w:t>
       </w:r>
       <w:r>
         <w:t>er</w:t>
@@ -195,98 +321,80 @@
         </w:numPr>
       </w:pPr>
       <w:r>
+        <w:t xml:space="preserve">As it is currently implemented, “war preparedness” is a debuff that affects the entire armed forces at the same time and goes away for the entire armed forces at the same time. But in real life, experience of modern war doesn’t automatically and quickly spread across the entire armed forces. In fact, there are plenty of famous cases where a part of the armed forces was </w:t>
+      </w:r>
+      <w:r>
+        <w:t xml:space="preserve">initially </w:t>
+      </w:r>
+      <w:r>
+        <w:t>kept out of battle</w:t>
+      </w:r>
+      <w:r>
+        <w:t>,</w:t>
+      </w:r>
+      <w:r>
+        <w:t xml:space="preserve"> </w:t>
+      </w:r>
+      <w:r>
+        <w:t xml:space="preserve">and when it finally saw combat, it </w:t>
+      </w:r>
+      <w:r>
+        <w:t xml:space="preserve">ended up repeating </w:t>
+      </w:r>
+      <w:r>
+        <w:t xml:space="preserve">many of </w:t>
+      </w:r>
+      <w:r>
+        <w:t>the same mistakes that other units have already learned to avoid. For example, I’ve heard this mentioned as a key cause for the major defeat of the British grouping in Singapore</w:t>
+      </w:r>
+      <w:r>
+        <w:t>. Similar problem of inexperience is often ascribed to the initial American defeats in Tunisia</w:t>
+      </w:r>
+      <w:r>
+        <w:t xml:space="preserve"> - w</w:t>
+      </w:r>
+      <w:r>
+        <w:t xml:space="preserve">hile combat was raging in the </w:t>
+      </w:r>
+      <w:r>
+        <w:t>P</w:t>
+      </w:r>
+      <w:r>
+        <w:t>acific, the 2</w:t>
+      </w:r>
+      <w:r>
+        <w:rPr>
+          <w:vertAlign w:val="superscript"/>
+        </w:rPr>
+        <w:t>nd</w:t>
+      </w:r>
+      <w:r>
+        <w:t xml:space="preserve"> Corps and its commanders were hanging out in England, </w:t>
+      </w:r>
+      <w:r>
+        <w:t>so</w:t>
+      </w:r>
+      <w:r>
+        <w:t xml:space="preserve"> when they finally entered battle, their inexperience became immediately apparent.</w:t>
+      </w:r>
+      <w:r>
+        <w:t xml:space="preserve"> This is practically impossible to meaningfully implement in the game. While the game does have an “experience” ranking of individual units and commanders, it is a very poor approximation and can’t be repurposed to represent that initial period of weakness and confusion.</w:t>
+      </w:r>
+    </w:p>
+    <w:p/>
+    <w:p>
+      <w:pPr>
+        <w:rPr>
+          <w:b/>
+          <w:bCs/>
+        </w:rPr>
+      </w:pPr>
+      <w:r>
+        <w:rPr>
+          <w:b/>
+          <w:bCs/>
+        </w:rPr>
         <w:lastRenderedPageBreak/>
-        <w:t xml:space="preserve">As it is currently implemented, “war preparedness” is a debuff that affects the entire armed forces at the same time and goes away for the entire armed forces at the same time. But in real life, experience of modern war doesn’t automatically and quickly spread across the entire armed forces. In fact, there are plenty of famous cases where a part of the armed forces was </w:t>
-      </w:r>
-      <w:r>
-        <w:t xml:space="preserve">initially </w:t>
-      </w:r>
-      <w:r>
-        <w:t>kept out of battle</w:t>
-      </w:r>
-      <w:r>
-        <w:t>,</w:t>
-      </w:r>
-      <w:r>
-        <w:t xml:space="preserve"> </w:t>
-      </w:r>
-      <w:r>
-        <w:t xml:space="preserve">and when it finally saw combat, it </w:t>
-      </w:r>
-      <w:r>
-        <w:t xml:space="preserve">ended up repeating </w:t>
-      </w:r>
-      <w:r>
-        <w:t xml:space="preserve">many of </w:t>
-      </w:r>
-      <w:r>
-        <w:t>the same mistakes that other units have already learned to avoid. For example, I’ve heard this mentioned as a key cause for the major defeat of the British grouping in Singapore</w:t>
-      </w:r>
-      <w:r>
-        <w:t>. Similar problem of inexperience is often ascribed to the initial American defeats in Tunisia</w:t>
-      </w:r>
-      <w:r>
-        <w:t xml:space="preserve"> - w</w:t>
-      </w:r>
-      <w:r>
-        <w:t xml:space="preserve">hile combat was raging in the </w:t>
-      </w:r>
-      <w:r>
-        <w:t>P</w:t>
-      </w:r>
-      <w:r>
-        <w:t>acific, the 2</w:t>
-      </w:r>
-      <w:r>
-        <w:rPr>
-          <w:vertAlign w:val="superscript"/>
-        </w:rPr>
-        <w:t>nd</w:t>
-      </w:r>
-      <w:r>
-        <w:t xml:space="preserve"> Corps and its commanders were hanging out in England, </w:t>
-      </w:r>
-      <w:r>
-        <w:t>so</w:t>
-      </w:r>
-      <w:r>
-        <w:t xml:space="preserve"> when they finally entered battle, their inexperience became immediately apparent.</w:t>
-      </w:r>
-      <w:r>
-        <w:t xml:space="preserve"> This is practically impossible to meaningfully implement in the game. While the game does have an “experience” ranking of individual units and commanders, it is a very poor approximation and can’t be repurposed to represent that initial period of weakness and confusion. For one thing, there is no “experience decay” when a unit is out of combat,</w:t>
-      </w:r>
-      <w:r>
-        <w:t xml:space="preserve"> </w:t>
-      </w:r>
-      <w:r>
-        <w:t>there is</w:t>
-      </w:r>
-      <w:r>
-        <w:t xml:space="preserve"> also</w:t>
-      </w:r>
-      <w:r>
-        <w:t xml:space="preserve"> no way to control different rates of experience gain for different </w:t>
-      </w:r>
-      <w:r>
-        <w:t>nations</w:t>
-      </w:r>
-      <w:r>
-        <w:t>, and many other problems.</w:t>
-      </w:r>
-    </w:p>
-    <w:p/>
-    <w:p>
-      <w:pPr>
-        <w:rPr>
-          <w:b/>
-          <w:bCs/>
-        </w:rPr>
-      </w:pPr>
-      <w:r>
-        <w:rPr>
-          <w:b/>
-          <w:bCs/>
-        </w:rPr>
         <w:t>Casualties of war</w:t>
       </w:r>
     </w:p>
@@ -605,7 +713,11 @@
         <w:t>portray or measure</w:t>
       </w:r>
       <w:r>
-        <w:t xml:space="preserve"> very well</w:t>
+        <w:t xml:space="preserve"> very </w:t>
+      </w:r>
+      <w:r>
+        <w:lastRenderedPageBreak/>
+        <w:t>well</w:t>
       </w:r>
       <w:r>
         <w:t xml:space="preserve">. In a recent example, the US accepted a humiliating defeat in Afghanistan in 2021, even through it suffered practically 0 losses in Afghanistan </w:t>
@@ -725,26 +837,231 @@
         <w:t>from the Great Depression (mainly US and Germany) will have a</w:t>
       </w:r>
       <w:r>
+        <w:t xml:space="preserve"> particularly</w:t>
+      </w:r>
+      <w:r>
+        <w:t xml:space="preserve"> rapid recovery during the first few years of the game, while the US specifically will have a GDP drop in 193</w:t>
+      </w:r>
+      <w:r>
+        <w:t>8</w:t>
+      </w:r>
+      <w:r>
+        <w:t xml:space="preserve"> reflecting the 193</w:t>
+      </w:r>
+      <w:r>
+        <w:t>8</w:t>
+      </w:r>
+      <w:r>
+        <w:t xml:space="preserve"> recession.</w:t>
+      </w:r>
+    </w:p>
+    <w:p>
+      <w:r>
+        <w:rPr>
+          <w:b/>
+        </w:rPr>
+        <w:t>The why</w:t>
+      </w:r>
+      <w:r>
+        <w:t xml:space="preserve">: </w:t>
+      </w:r>
+      <w:r>
+        <w:t xml:space="preserve">The </w:t>
+      </w:r>
+      <w:r>
+        <w:t xml:space="preserve">HOI </w:t>
+      </w:r>
+      <w:r>
+        <w:t xml:space="preserve">model of manual IC building means that </w:t>
+      </w:r>
+      <w:r>
+        <w:t>you</w:t>
+      </w:r>
+      <w:r>
+        <w:t xml:space="preserve"> can</w:t>
+      </w:r>
+      <w:r>
+        <w:t xml:space="preserve"> use your current industrial output to construct additional factories</w:t>
+      </w:r>
+      <w:r>
+        <w:t>,</w:t>
+      </w:r>
+      <w:r>
+        <w:t xml:space="preserve"> and grow your output </w:t>
+      </w:r>
+      <w:r>
+        <w:t xml:space="preserve">exponentially </w:t>
+      </w:r>
+      <w:r>
+        <w:t>as much as your fixed resource base allows</w:t>
+      </w:r>
+      <w:r>
+        <w:t>. This</w:t>
+      </w:r>
+      <w:r>
+        <w:t xml:space="preserve"> economic model is IMHO way too simple and unrealistic, and more importantly, it just </w:t>
+      </w:r>
+      <w:r>
+        <w:t xml:space="preserve">doesn’t result in very good gameplay from my perspective. </w:t>
+      </w:r>
+      <w:r>
+        <w:t>In this model, a</w:t>
+      </w:r>
+      <w:r>
+        <w:t xml:space="preserve"> player</w:t>
+      </w:r>
+      <w:r>
+        <w:t xml:space="preserve"> typically</w:t>
+      </w:r>
+      <w:r>
+        <w:t xml:space="preserve"> start</w:t>
+      </w:r>
+      <w:r>
+        <w:t>s</w:t>
+      </w:r>
+      <w:r>
+        <w:t xml:space="preserve"> with a fixed resource base that is way above </w:t>
+      </w:r>
+      <w:r>
+        <w:t>his</w:t>
+      </w:r>
+      <w:r>
+        <w:t xml:space="preserve"> needs, leading to </w:t>
+      </w:r>
+      <w:r>
+        <w:t>large</w:t>
+      </w:r>
+      <w:r>
+        <w:t xml:space="preserve"> over-stockpile limit losses and </w:t>
+      </w:r>
+      <w:r>
+        <w:t xml:space="preserve">a </w:t>
+      </w:r>
+      <w:r>
+        <w:t>broken trade system</w:t>
+      </w:r>
+      <w:r>
+        <w:t xml:space="preserve">. Germany was historically a huge coal exporter prior to the war and made good money that way, but very few nations in the game in 1936 will genuinely need extra coal, most will be drowning in unneeded coal instead. From 1936 to 1938 </w:t>
+      </w:r>
+      <w:r>
+        <w:t>the player</w:t>
+      </w:r>
+      <w:r>
+        <w:t xml:space="preserve"> will typically do very little but build extra IC, resulting in a largely wasted “IC greed” phase of the game.</w:t>
+      </w:r>
+      <w:r>
+        <w:t xml:space="preserve"> The only strategy involved during that phase is potentially choosing the provinces where to build IC, which in itself is highly unrealistic </w:t>
+      </w:r>
+      <w:r>
+        <w:t xml:space="preserve">IMHO </w:t>
+      </w:r>
+      <w:r>
+        <w:t>– most countries did not have the luxury of being able to build new factories just wherever they wanted.</w:t>
+      </w:r>
+      <w:r>
         <w:t xml:space="preserve"> </w:t>
       </w:r>
       <w:r>
+        <w:t>A</w:t>
+      </w:r>
+      <w:r>
+        <w:t xml:space="preserve"> player will </w:t>
+      </w:r>
+      <w:r>
+        <w:t xml:space="preserve">then </w:t>
+      </w:r>
+      <w:r>
+        <w:t xml:space="preserve">abruptly </w:t>
+      </w:r>
+      <w:r>
+        <w:t>stop</w:t>
+      </w:r>
+      <w:r>
+        <w:t xml:space="preserve"> building extra IC and switch to military production</w:t>
+      </w:r>
+      <w:r>
+        <w:t xml:space="preserve"> at a point of his choosing</w:t>
+      </w:r>
+      <w:r>
+        <w:t>, and from that point his industrial output is more or less fixed, unless he conquers or loses territory of course. None of that seems particularly realistic or makes for good gameplay in my opinion.</w:t>
+      </w:r>
+      <w:r>
+        <w:t xml:space="preserve"> I decided to axe the “IC </w:t>
+      </w:r>
+      <w:r>
         <w:lastRenderedPageBreak/>
-        <w:t>particularly</w:t>
-      </w:r>
-      <w:r>
-        <w:t xml:space="preserve"> rapid recovery during the first few years of the game, while the US specifically will have a GDP drop in 193</w:t>
-      </w:r>
-      <w:r>
-        <w:t>8</w:t>
-      </w:r>
-      <w:r>
-        <w:t xml:space="preserve"> reflecting the 193</w:t>
-      </w:r>
-      <w:r>
-        <w:t>8</w:t>
-      </w:r>
-      <w:r>
-        <w:t xml:space="preserve"> recession.</w:t>
+        <w:t xml:space="preserve">greed” thing entirely and make economic growth a factor that </w:t>
+      </w:r>
+      <w:r>
+        <w:t>is difficult to</w:t>
+      </w:r>
+      <w:r>
+        <w:t xml:space="preserve"> control directly. Meanwhile, the resource base will also grow, but that growth is entirely historical and unaffected by in-game factors. It is taken directly from the TRP mod which had presumably done tremendous research into this subject. The resources.txt file is almost a direct copy of the file from TRP</w:t>
+      </w:r>
+      <w:r>
+        <w:t>, taken with permission.</w:t>
+      </w:r>
+    </w:p>
+    <w:p/>
+    <w:p>
+      <w:pPr>
+        <w:rPr>
+          <w:b/>
+          <w:bCs/>
+        </w:rPr>
+      </w:pPr>
+      <w:r>
+        <w:rPr>
+          <w:b/>
+          <w:bCs/>
+        </w:rPr>
+        <w:t xml:space="preserve">Grand </w:t>
+      </w:r>
+      <w:r>
+        <w:rPr>
+          <w:b/>
+          <w:bCs/>
+        </w:rPr>
+        <w:t>O</w:t>
+      </w:r>
+      <w:r>
+        <w:rPr>
+          <w:b/>
+          <w:bCs/>
+        </w:rPr>
+        <w:t>ffensive</w:t>
+      </w:r>
+    </w:p>
+    <w:p>
+      <w:r>
+        <w:rPr>
+          <w:b/>
+        </w:rPr>
+        <w:t>The what</w:t>
+      </w:r>
+      <w:r>
+        <w:t xml:space="preserve">: </w:t>
+      </w:r>
+      <w:r>
+        <w:t xml:space="preserve">The </w:t>
+      </w:r>
+      <w:r>
+        <w:t xml:space="preserve">Grand </w:t>
+      </w:r>
+      <w:r>
+        <w:t>O</w:t>
+      </w:r>
+      <w:r>
+        <w:t xml:space="preserve">ffensive is now repeatable; you can do it once every </w:t>
+      </w:r>
+      <w:r>
+        <w:t xml:space="preserve">6 months. It is available to all countries, not just majors. Instead of a fixed upfront cost of 10,000 supplies, </w:t>
+      </w:r>
+      <w:r>
+        <w:t xml:space="preserve">there is no upfront cost, but </w:t>
+      </w:r>
+      <w:r>
+        <w:t>it significantly increases the supply consumption (and fuel consumption) of all units for the duration of the offensive, which is still 30 days.</w:t>
       </w:r>
     </w:p>
     <w:p>
@@ -758,136 +1075,305 @@
         <w:t xml:space="preserve">: </w:t>
       </w:r>
       <w:r>
-        <w:t xml:space="preserve">The </w:t>
-      </w:r>
-      <w:r>
-        <w:t xml:space="preserve">HOI </w:t>
-      </w:r>
-      <w:r>
-        <w:t xml:space="preserve">model of manual IC building means that </w:t>
-      </w:r>
-      <w:r>
-        <w:t>you</w:t>
-      </w:r>
-      <w:r>
-        <w:t xml:space="preserve"> can</w:t>
-      </w:r>
-      <w:r>
-        <w:t xml:space="preserve"> use your current industrial output to construct additional factories</w:t>
+        <w:t>The</w:t>
+      </w:r>
+      <w:r>
+        <w:t xml:space="preserve"> “grand offensive” </w:t>
+      </w:r>
+      <w:r>
+        <w:t xml:space="preserve">is a neat </w:t>
+      </w:r>
+      <w:r>
+        <w:t>idea</w:t>
+      </w:r>
+      <w:r>
+        <w:t xml:space="preserve">, </w:t>
+      </w:r>
+      <w:r>
+        <w:t xml:space="preserve">but </w:t>
+      </w:r>
+      <w:r>
+        <w:t xml:space="preserve">it seems a bit too gamey for it to just be available “once per game”. </w:t>
+      </w:r>
+      <w:r>
+        <w:t xml:space="preserve">Making it repeatable IMHO turns it into a fun gameplay mechanic – you can keep weighing your options every six months as to when and how you want to launch the next “big offensive” and whether the cost is worth the possible gains you might get from it, or it’s likely going to be a waste of valuable resources. Likewise, there is no reason why grand offensives should only be available to majors, all countries should be able to launch them, and the cost should definitely not be fixed, but proportional to the actual size of the army/navy/air. Perhaps the only way in the game to make the cost proportional to the size of the armed forces is to </w:t>
+      </w:r>
+      <w:r>
+        <w:t xml:space="preserve">simply </w:t>
+      </w:r>
+      <w:r>
+        <w:t xml:space="preserve">increase the supply consumption of all units for </w:t>
+      </w:r>
+      <w:r>
+        <w:t>the duration of the offensive</w:t>
+      </w:r>
+      <w:r>
+        <w:t>, so this is how it was implemented.</w:t>
+      </w:r>
+    </w:p>
+    <w:p/>
+    <w:p>
+      <w:pPr>
+        <w:rPr>
+          <w:b/>
+          <w:bCs/>
+        </w:rPr>
+      </w:pPr>
+      <w:r>
+        <w:rPr>
+          <w:b/>
+          <w:bCs/>
+        </w:rPr>
+        <w:t>Permanent IC Damage</w:t>
+      </w:r>
+    </w:p>
+    <w:p>
+      <w:r>
+        <w:rPr>
+          <w:b/>
+        </w:rPr>
+        <w:t>The what</w:t>
+      </w:r>
+      <w:r>
+        <w:t xml:space="preserve">: Cities with IC concentration of </w:t>
+      </w:r>
+      <w:r>
+        <w:t>2</w:t>
+      </w:r>
+      <w:r>
+        <w:t xml:space="preserve"> and above can now suffer permanent IC damage from combat and </w:t>
+      </w:r>
+      <w:r>
+        <w:t xml:space="preserve">from </w:t>
+      </w:r>
+      <w:r>
+        <w:t>strategic bombing</w:t>
+      </w:r>
+      <w:r>
+        <w:t>. Every 10 days</w:t>
       </w:r>
       <w:r>
         <w:t>,</w:t>
       </w:r>
       <w:r>
-        <w:t xml:space="preserve"> and grow your output </w:t>
-      </w:r>
-      <w:r>
-        <w:t xml:space="preserve">exponentially </w:t>
-      </w:r>
-      <w:r>
-        <w:t>as much as your fixed resource base allows</w:t>
-      </w:r>
-      <w:r>
-        <w:t>. This</w:t>
-      </w:r>
-      <w:r>
-        <w:t xml:space="preserve"> economic model is IMHO way too simple and unrealistic, and more importantly, it just </w:t>
-      </w:r>
-      <w:r>
-        <w:t xml:space="preserve">doesn’t result in very good gameplay from my perspective. </w:t>
-      </w:r>
-      <w:r>
-        <w:t>In this model, a</w:t>
-      </w:r>
-      <w:r>
-        <w:t xml:space="preserve"> player</w:t>
-      </w:r>
-      <w:r>
-        <w:t xml:space="preserve"> typically</w:t>
-      </w:r>
-      <w:r>
-        <w:t xml:space="preserve"> start</w:t>
-      </w:r>
-      <w:r>
-        <w:t>s</w:t>
-      </w:r>
-      <w:r>
-        <w:t xml:space="preserve"> with a fixed resource base that is way above </w:t>
-      </w:r>
-      <w:r>
-        <w:t>his</w:t>
-      </w:r>
-      <w:r>
-        <w:t xml:space="preserve"> needs, leading to </w:t>
-      </w:r>
-      <w:r>
-        <w:t>large</w:t>
-      </w:r>
-      <w:r>
-        <w:t xml:space="preserve"> over-stockpile limit losses and </w:t>
+        <w:t xml:space="preserve"> a</w:t>
+      </w:r>
+      <w:r>
+        <w:t xml:space="preserve"> background</w:t>
+      </w:r>
+      <w:r>
+        <w:t xml:space="preserve"> event will check the current IC, and if it is</w:t>
+      </w:r>
+      <w:r>
+        <w:t xml:space="preserve"> </w:t>
+      </w:r>
+      <w:r>
+        <w:t>less than 1/</w:t>
+      </w:r>
+      <w:r>
+        <w:t>3</w:t>
+      </w:r>
+      <w:r>
+        <w:rPr>
+          <w:vertAlign w:val="superscript"/>
+        </w:rPr>
+        <w:t>rd</w:t>
+      </w:r>
+      <w:r>
+        <w:t xml:space="preserve"> </w:t>
+      </w:r>
+      <w:r>
+        <w:t>of the city’s base IC</w:t>
+      </w:r>
+      <w:r>
+        <w:t xml:space="preserve"> (the proportion is slightly higher for big cities and lower for small cities</w:t>
+      </w:r>
+      <w:r>
+        <w:t>, so bigger cities are easier to damage</w:t>
+      </w:r>
+      <w:r>
+        <w:t>)</w:t>
+      </w:r>
+      <w:r>
+        <w:t>, the city will be considered “heavily damaged” and it will suffer a</w:t>
+      </w:r>
+      <w:r>
+        <w:t xml:space="preserve"> 1%</w:t>
+      </w:r>
+      <w:r>
+        <w:t xml:space="preserve"> base IC reduction.</w:t>
+      </w:r>
+      <w:r>
+        <w:t xml:space="preserve"> </w:t>
+      </w:r>
+      <w:r>
+        <w:t xml:space="preserve">40% </w:t>
+      </w:r>
+      <w:r>
+        <w:t xml:space="preserve">of that damage will be </w:t>
+      </w:r>
+      <w:r>
+        <w:t>auto-</w:t>
+      </w:r>
+      <w:r>
+        <w:t>repaired after a year,</w:t>
+      </w:r>
+      <w:r>
+        <w:t xml:space="preserve"> </w:t>
+      </w:r>
+      <w:r>
+        <w:t xml:space="preserve">another 40% </w:t>
+      </w:r>
+      <w:r>
+        <w:t xml:space="preserve">will be </w:t>
+      </w:r>
+      <w:r>
+        <w:t>au</w:t>
+      </w:r>
+      <w:r>
+        <w:t>t</w:t>
+      </w:r>
+      <w:r>
+        <w:t>o-</w:t>
+      </w:r>
+      <w:r>
+        <w:t xml:space="preserve">repaired after 5 years, </w:t>
+      </w:r>
+      <w:r>
+        <w:t xml:space="preserve">while the remaining </w:t>
+      </w:r>
+      <w:r>
+        <w:t>20%</w:t>
+      </w:r>
+      <w:r>
+        <w:t xml:space="preserve"> </w:t>
+      </w:r>
+      <w:r>
+        <w:t>are</w:t>
+      </w:r>
+      <w:r>
+        <w:t xml:space="preserve"> the city’s permanent IC loss</w:t>
+      </w:r>
+      <w:r>
+        <w:t xml:space="preserve"> and will not be repaired</w:t>
+      </w:r>
+      <w:r>
+        <w:t xml:space="preserve"> automatically</w:t>
+      </w:r>
+      <w:r>
+        <w:t>. Protect your cities!</w:t>
+      </w:r>
+    </w:p>
+    <w:p>
+      <w:r>
+        <w:rPr>
+          <w:b/>
+          <w:bCs/>
+        </w:rPr>
+        <w:t>The why</w:t>
+      </w:r>
+      <w:r>
+        <w:t xml:space="preserve">: IMHO it is a serious flaw of the DH engine that all provincial damage is </w:t>
+      </w:r>
+      <w:r>
+        <w:t>quickly</w:t>
+      </w:r>
+      <w:r>
+        <w:t xml:space="preserve"> auto-repaired at no cost to the country</w:t>
+      </w:r>
+      <w:r>
+        <w:t xml:space="preserve"> and at a fixed rate</w:t>
+      </w:r>
+      <w:r>
+        <w:t xml:space="preserve">. Simply reducing the repair modifier to make the repairs slower would not really solve the problem, </w:t>
+      </w:r>
+      <w:r>
+        <w:t xml:space="preserve">rather </w:t>
+      </w:r>
+      <w:r>
+        <w:t xml:space="preserve">it would create new </w:t>
+      </w:r>
+      <w:r>
+        <w:t>problems</w:t>
+      </w:r>
+      <w:r>
+        <w:t xml:space="preserve">. A good model </w:t>
+      </w:r>
+      <w:r>
+        <w:t xml:space="preserve">perhaps </w:t>
+      </w:r>
+      <w:r>
+        <w:t xml:space="preserve">would be “logarithmic repairs”, where a heavily damaged province would initially repair very fast, but repairs would slow down over time and getting the province back to its original </w:t>
+      </w:r>
+      <w:r>
+        <w:t xml:space="preserve">capacity would become increasingly difficult. It’s not quite possible to implement </w:t>
+      </w:r>
+      <w:r>
+        <w:t xml:space="preserve">that </w:t>
+      </w:r>
+      <w:r>
+        <w:t xml:space="preserve">in the game, but this is the closest approximation that I’ve come up with. It </w:t>
+      </w:r>
+      <w:r>
+        <w:t xml:space="preserve">gives additional incentive to protect </w:t>
+      </w:r>
+      <w:r>
+        <w:lastRenderedPageBreak/>
+        <w:t xml:space="preserve">major cities from bombing and capture, and </w:t>
+      </w:r>
+      <w:r>
+        <w:t>also gives some idea why certain countries in WW2 were not too eager to fight for their cities and preferred to hand them over peacefully or outright surrender rather than risk permanent damage</w:t>
+      </w:r>
+      <w:r>
+        <w:t xml:space="preserve"> (i.e. Paris)</w:t>
+      </w:r>
+      <w:r>
+        <w:t>.</w:t>
+      </w:r>
+      <w:r>
+        <w:t xml:space="preserve"> </w:t>
+      </w:r>
+      <w:r>
+        <w:t xml:space="preserve">So, for example, Cologne has </w:t>
       </w:r>
       <w:r>
         <w:t xml:space="preserve">a </w:t>
       </w:r>
       <w:r>
-        <w:t>broken trade system</w:t>
-      </w:r>
-      <w:r>
-        <w:t xml:space="preserve">. Germany was historically a huge coal exporter prior to the war and made good money that way, but very few nations in the game in 1936 will genuinely need extra coal, most will be drowning in unneeded coal instead. From 1936 to 1938 </w:t>
-      </w:r>
-      <w:r>
-        <w:t>the player</w:t>
-      </w:r>
-      <w:r>
-        <w:t xml:space="preserve"> will typically do very little but build extra IC, resulting in a largely wasted “IC greed” phase of the game.</w:t>
-      </w:r>
-      <w:r>
-        <w:t xml:space="preserve"> The only strategy involved during that phase is potentially choosing the provinces where to build IC, which in itself is highly unrealistic </w:t>
-      </w:r>
-      <w:r>
-        <w:t xml:space="preserve">IMHO </w:t>
-      </w:r>
-      <w:r>
-        <w:t>– most countries did not have the luxury of being able to build new factories just wherever they wanted.</w:t>
+        <w:t>base IC of 10.</w:t>
       </w:r>
       <w:r>
         <w:t xml:space="preserve"> </w:t>
       </w:r>
       <w:r>
-        <w:t>A</w:t>
-      </w:r>
-      <w:r>
-        <w:t xml:space="preserve"> player will </w:t>
-      </w:r>
-      <w:r>
-        <w:t xml:space="preserve">then </w:t>
-      </w:r>
-      <w:r>
-        <w:t xml:space="preserve">abruptly </w:t>
-      </w:r>
-      <w:r>
-        <w:t>stop</w:t>
-      </w:r>
-      <w:r>
-        <w:t xml:space="preserve"> building extra IC and switch to military production</w:t>
-      </w:r>
-      <w:r>
-        <w:t xml:space="preserve"> at a point of his choosing</w:t>
-      </w:r>
-      <w:r>
-        <w:t>, and from that point his industrial output is more or less fixed, unless he conquers or loses territory of course. None of that seems particularly realistic or makes for good gameplay in my opinion.</w:t>
-      </w:r>
-      <w:r>
-        <w:t xml:space="preserve"> I decided to axe the “IC greed” thing entirely and make economic growth a factor that </w:t>
-      </w:r>
-      <w:r>
-        <w:t>is difficult to</w:t>
-      </w:r>
-      <w:r>
-        <w:t xml:space="preserve"> control directly. Meanwhile, the resource base will also grow, but that growth is entirely historical and unaffected by in-game factors. It is taken directly from the TRP mod which had presumably done tremendous research into this subject. The resources.txt file is almost a direct copy of the file from TRP</w:t>
-      </w:r>
-      <w:r>
-        <w:t>, taken with permission.</w:t>
+        <w:t>If its IC drops below 3.3</w:t>
+      </w:r>
+      <w:r>
+        <w:t xml:space="preserve"> and stays under it for at least a few days</w:t>
+      </w:r>
+      <w:r>
+        <w:t xml:space="preserve">, it will get -0.1 IC in damage. Beware that the event fires every 10 days, so if the city </w:t>
+      </w:r>
+      <w:r>
+        <w:t>keeps</w:t>
+      </w:r>
+      <w:r>
+        <w:t xml:space="preserve"> get</w:t>
+      </w:r>
+      <w:r>
+        <w:t>ting</w:t>
+      </w:r>
+      <w:r>
+        <w:t xml:space="preserve"> bombed during that time</w:t>
+      </w:r>
+      <w:r>
+        <w:t>, it will get another tick of -0.1 IC in damage. From every -0.1 IC that the city took in damage, it will get +0.04 in repairs after a year, and another +0.04 after 5 years. The remaining 0.02</w:t>
+      </w:r>
+      <w:r>
+        <w:t xml:space="preserve"> IC</w:t>
+      </w:r>
+      <w:r>
+        <w:t xml:space="preserve"> will not be repaired.</w:t>
       </w:r>
     </w:p>
     <w:p/>
@@ -903,21 +1389,7 @@
           <w:b/>
           <w:bCs/>
         </w:rPr>
-        <w:t xml:space="preserve">Grand </w:t>
-      </w:r>
-      <w:r>
-        <w:rPr>
-          <w:b/>
-          <w:bCs/>
-        </w:rPr>
-        <w:t>O</w:t>
-      </w:r>
-      <w:r>
-        <w:rPr>
-          <w:b/>
-          <w:bCs/>
-        </w:rPr>
-        <w:t>ffensive</w:t>
+        <w:t>AI auto-invasions</w:t>
       </w:r>
     </w:p>
     <w:p>
@@ -928,28 +1400,58 @@
         <w:t>The what</w:t>
       </w:r>
       <w:r>
-        <w:t xml:space="preserve">: </w:t>
-      </w:r>
-      <w:r>
-        <w:t xml:space="preserve">The </w:t>
-      </w:r>
-      <w:r>
-        <w:t xml:space="preserve">Grand </w:t>
-      </w:r>
-      <w:r>
-        <w:t>O</w:t>
-      </w:r>
-      <w:r>
-        <w:t xml:space="preserve">ffensive is now repeatable; you can do it once every </w:t>
-      </w:r>
-      <w:r>
-        <w:t xml:space="preserve">6 months. It is available to all countries, not just majors. Instead of a fixed upfront cost of 10,000 supplies, </w:t>
-      </w:r>
-      <w:r>
-        <w:t xml:space="preserve">there is no upfront cost, but </w:t>
-      </w:r>
-      <w:r>
-        <w:t>it significantly increases the supply consumption (and fuel consumption) of all units for the duration of the offensive, which is still 30 days.</w:t>
+        <w:t xml:space="preserve">: There are events to help AI launch main historical amphibious invasions for Germany, Japan, and US/UK. While it </w:t>
+      </w:r>
+      <w:r>
+        <w:rPr>
+          <w:u w:val="single"/>
+        </w:rPr>
+        <w:t>is</w:t>
+      </w:r>
+      <w:r>
+        <w:t xml:space="preserve"> </w:t>
+      </w:r>
+      <w:r>
+        <w:t xml:space="preserve">obviously </w:t>
+      </w:r>
+      <w:r>
+        <w:t xml:space="preserve">an AI cheat, the units themselves are not free. The AI will </w:t>
+      </w:r>
+      <w:r>
+        <w:rPr>
+          <w:u w:val="single"/>
+        </w:rPr>
+        <w:t>always</w:t>
+      </w:r>
+      <w:r>
+        <w:t xml:space="preserve"> lose as many divisions as it</w:t>
+      </w:r>
+      <w:r>
+        <w:t xml:space="preserve"> appears to</w:t>
+      </w:r>
+      <w:r>
+        <w:t xml:space="preserve"> </w:t>
+      </w:r>
+      <w:r>
+        <w:t>“</w:t>
+      </w:r>
+      <w:r>
+        <w:t>gain” in the invasion</w:t>
+      </w:r>
+      <w:r>
+        <w:t>, ideally, of the same exact name and type. Effectively, the goal of the cheat is to simply “teleport”</w:t>
+      </w:r>
+      <w:r>
+        <w:t xml:space="preserve"> existing</w:t>
+      </w:r>
+      <w:r>
+        <w:t xml:space="preserve"> divisions to the desired location</w:t>
+      </w:r>
+      <w:r>
+        <w:t>, but without giving the AI anything for free</w:t>
+      </w:r>
+      <w:r>
+        <w:t>.</w:t>
       </w:r>
     </w:p>
     <w:p>
@@ -960,43 +1462,28 @@
         <w:t>The why</w:t>
       </w:r>
       <w:r>
-        <w:t xml:space="preserve">: </w:t>
-      </w:r>
-      <w:r>
-        <w:t>The</w:t>
-      </w:r>
-      <w:r>
-        <w:t xml:space="preserve"> “grand offensive” </w:t>
-      </w:r>
-      <w:r>
-        <w:t xml:space="preserve">is a neat </w:t>
-      </w:r>
-      <w:r>
-        <w:t>idea</w:t>
-      </w:r>
-      <w:r>
-        <w:t xml:space="preserve">, </w:t>
-      </w:r>
-      <w:r>
-        <w:t xml:space="preserve">but </w:t>
-      </w:r>
-      <w:r>
-        <w:t xml:space="preserve">it seems a bit too gamey for it to just be available “once per game”. </w:t>
-      </w:r>
-      <w:r>
-        <w:t xml:space="preserve">Making it repeatable IMHO turns it into a fun gameplay mechanic – you can keep weighing your options every six months as to when and how you want to launch the next “big offensive” and whether the cost is worth the possible gains you might get from it, or it’s likely going to be a waste of valuable resources. Likewise, there is no reason why grand offensives should only be available to majors, all countries should be able to launch them, and the cost should definitely not be fixed, but proportional to the actual size of the army/navy/air. Perhaps the only way in the game to make the cost proportional to the size of the armed forces is to </w:t>
-      </w:r>
-      <w:r>
-        <w:t xml:space="preserve">simply </w:t>
-      </w:r>
-      <w:r>
-        <w:t xml:space="preserve">increase the supply consumption of all units for </w:t>
-      </w:r>
-      <w:r>
-        <w:t>the duration of the offensive</w:t>
-      </w:r>
-      <w:r>
-        <w:t>, so this is how it was implemented.</w:t>
+        <w:t>: AI in general is very bad in DH,</w:t>
+      </w:r>
+      <w:r>
+        <w:t xml:space="preserve"> but</w:t>
+      </w:r>
+      <w:r>
+        <w:t xml:space="preserve"> the invasion AI is perhaps among the worst. Many if not most historical invasions, especially by the Axis, relied heavily upon scale and speed, which the native invasion AI will never be able to replicate on its own. It will typically take weeks to months to prepare an invasion, it will launch it with at most a few divisions, often </w:t>
+      </w:r>
+      <w:r>
+        <w:t>choosing divisions in a very suboptimal way that is</w:t>
+      </w:r>
+      <w:r>
+        <w:t xml:space="preserve"> less than ideal for the task, and even if by some miracle it succeeds at establishing a beachhead, it will be at loss how to exploit it and will usually get kicked out within a week if the enemy has any army at all to contest the landing.</w:t>
+      </w:r>
+      <w:r>
+        <w:t xml:space="preserve"> And at any point during this process, a about a million things can go wrong where the AI just ends up cancelling the invasion altogether of bungling it up completely. </w:t>
+      </w:r>
+      <w:r>
+        <w:t xml:space="preserve"> With that in mind, </w:t>
+      </w:r>
+      <w:r>
+        <w:t>I felt like a few event-driven invasions were required to at least cover the base historical invasion scenarios.</w:t>
       </w:r>
     </w:p>
     <w:p/>
@@ -1012,7 +1499,7 @@
           <w:b/>
           <w:bCs/>
         </w:rPr>
-        <w:t>Permanent IC Damage</w:t>
+        <w:t>Puppets</w:t>
       </w:r>
     </w:p>
     <w:p>
@@ -1023,395 +1510,21 @@
         <w:t>The what</w:t>
       </w:r>
       <w:r>
-        <w:t xml:space="preserve">: Cities with IC concentration of </w:t>
-      </w:r>
-      <w:r>
-        <w:t>2</w:t>
-      </w:r>
-      <w:r>
-        <w:t xml:space="preserve"> and above can now suffer permanent IC damage from combat and </w:t>
-      </w:r>
-      <w:r>
-        <w:t xml:space="preserve">from </w:t>
-      </w:r>
-      <w:r>
-        <w:t>strategic bombing</w:t>
-      </w:r>
-      <w:r>
-        <w:t>. Every 10 days</w:t>
-      </w:r>
-      <w:r>
-        <w:t>,</w:t>
-      </w:r>
-      <w:r>
-        <w:t xml:space="preserve"> a</w:t>
-      </w:r>
-      <w:r>
-        <w:t xml:space="preserve"> background</w:t>
-      </w:r>
-      <w:r>
-        <w:t xml:space="preserve"> event will check the current IC, and if it is</w:t>
-      </w:r>
-      <w:r>
-        <w:t xml:space="preserve"> </w:t>
-      </w:r>
-      <w:r>
-        <w:t>less than 1/</w:t>
-      </w:r>
-      <w:r>
-        <w:t>3</w:t>
-      </w:r>
-      <w:r>
-        <w:rPr>
-          <w:vertAlign w:val="superscript"/>
-        </w:rPr>
-        <w:t>rd</w:t>
-      </w:r>
-      <w:r>
-        <w:t xml:space="preserve"> </w:t>
-      </w:r>
-      <w:r>
-        <w:t>of the city’s base IC</w:t>
-      </w:r>
-      <w:r>
-        <w:t xml:space="preserve"> (the proportion is slightly higher for big cities and lower for small cities</w:t>
-      </w:r>
-      <w:r>
-        <w:t>, so bigger cities are easier to damage</w:t>
-      </w:r>
-      <w:r>
-        <w:t>)</w:t>
-      </w:r>
-      <w:r>
-        <w:t>, the city will be considered “heavily damaged” and it will suffer a</w:t>
-      </w:r>
-      <w:r>
-        <w:t xml:space="preserve"> 1%</w:t>
-      </w:r>
-      <w:r>
-        <w:t xml:space="preserve"> base IC reduction.</w:t>
-      </w:r>
-      <w:r>
-        <w:t xml:space="preserve"> </w:t>
-      </w:r>
-      <w:r>
-        <w:t xml:space="preserve">40% </w:t>
-      </w:r>
-      <w:r>
-        <w:t xml:space="preserve">of that damage will be </w:t>
-      </w:r>
-      <w:r>
-        <w:t>auto-</w:t>
-      </w:r>
-      <w:r>
-        <w:t>repaired after a year,</w:t>
-      </w:r>
-      <w:r>
-        <w:t xml:space="preserve"> </w:t>
-      </w:r>
-      <w:r>
-        <w:t xml:space="preserve">another 40% </w:t>
-      </w:r>
-      <w:r>
-        <w:t xml:space="preserve">will be </w:t>
-      </w:r>
-      <w:r>
-        <w:t>au</w:t>
-      </w:r>
-      <w:r>
-        <w:t>t</w:t>
-      </w:r>
-      <w:r>
-        <w:t>o-</w:t>
-      </w:r>
-      <w:r>
-        <w:t xml:space="preserve">repaired after 5 years, </w:t>
-      </w:r>
-      <w:r>
-        <w:t xml:space="preserve">while the remaining </w:t>
-      </w:r>
-      <w:r>
-        <w:t>20%</w:t>
-      </w:r>
-      <w:r>
-        <w:t xml:space="preserve"> </w:t>
-      </w:r>
-      <w:r>
-        <w:t>are</w:t>
-      </w:r>
-      <w:r>
-        <w:t xml:space="preserve"> the city’s permanent IC loss</w:t>
-      </w:r>
-      <w:r>
-        <w:t xml:space="preserve"> and will not be repaired</w:t>
-      </w:r>
-      <w:r>
-        <w:t xml:space="preserve"> automatically</w:t>
-      </w:r>
-      <w:r>
-        <w:t>. Protect your cities!</w:t>
-      </w:r>
-    </w:p>
-    <w:p>
-      <w:r>
-        <w:rPr>
-          <w:b/>
-          <w:bCs/>
-        </w:rPr>
-        <w:t>The why</w:t>
-      </w:r>
-      <w:r>
-        <w:t xml:space="preserve">: IMHO it is a serious flaw of the DH engine that all provincial damage is </w:t>
-      </w:r>
-      <w:r>
-        <w:t>quickly</w:t>
-      </w:r>
-      <w:r>
-        <w:t xml:space="preserve"> auto-repaired at no cost to the country</w:t>
-      </w:r>
-      <w:r>
-        <w:t xml:space="preserve"> and at a fixed rate</w:t>
-      </w:r>
-      <w:r>
-        <w:t xml:space="preserve">. Simply reducing the repair modifier to make the repairs slower would not really solve the problem, </w:t>
-      </w:r>
-      <w:r>
-        <w:t xml:space="preserve">rather </w:t>
-      </w:r>
-      <w:r>
-        <w:t xml:space="preserve">it would create new </w:t>
-      </w:r>
-      <w:r>
-        <w:t>problems</w:t>
-      </w:r>
-      <w:r>
-        <w:t xml:space="preserve">. A good model </w:t>
-      </w:r>
-      <w:r>
-        <w:t xml:space="preserve">perhaps </w:t>
-      </w:r>
-      <w:r>
-        <w:t xml:space="preserve">would be “logarithmic repairs”, where a heavily damaged province would initially repair very fast, but repairs would slow down over time and getting the province back to its original </w:t>
-      </w:r>
-      <w:r>
-        <w:t xml:space="preserve">capacity would become increasingly difficult. It’s not quite possible to implement </w:t>
-      </w:r>
-      <w:r>
-        <w:t xml:space="preserve">that </w:t>
-      </w:r>
-      <w:r>
-        <w:t xml:space="preserve">in the game, but this is the closest approximation that I’ve come up with. It </w:t>
-      </w:r>
-      <w:r>
-        <w:t xml:space="preserve">gives additional incentive to protect major cities from bombing and capture, and </w:t>
-      </w:r>
-      <w:r>
-        <w:t>also gives some idea why certain countries in WW2 were not too eager to fight for their cities and preferred to hand them over peacefully or outright surrender rather than risk permanent damage</w:t>
-      </w:r>
-      <w:r>
-        <w:t xml:space="preserve"> (i.e. Paris)</w:t>
-      </w:r>
-      <w:r>
-        <w:t>.</w:t>
-      </w:r>
-      <w:r>
-        <w:t xml:space="preserve"> </w:t>
-      </w:r>
-      <w:r>
-        <w:t xml:space="preserve">So, for example, Cologne has </w:t>
-      </w:r>
-      <w:r>
-        <w:t xml:space="preserve">a </w:t>
-      </w:r>
-      <w:r>
-        <w:t>base IC of 10.</w:t>
-      </w:r>
-      <w:r>
-        <w:t xml:space="preserve"> </w:t>
-      </w:r>
-      <w:r>
-        <w:t>If its IC drops below 3.3</w:t>
-      </w:r>
-      <w:r>
-        <w:t xml:space="preserve"> and stays under it for at least a few days</w:t>
-      </w:r>
-      <w:r>
-        <w:t xml:space="preserve">, it will get -0.1 IC in damage. Beware that the event fires every 10 days, so if the city </w:t>
-      </w:r>
-      <w:r>
-        <w:t>keeps</w:t>
-      </w:r>
-      <w:r>
-        <w:t xml:space="preserve"> get</w:t>
-      </w:r>
-      <w:r>
-        <w:t>ting</w:t>
-      </w:r>
-      <w:r>
-        <w:t xml:space="preserve"> bombed during that time</w:t>
-      </w:r>
-      <w:r>
-        <w:t>, it will get another tick of -0.1 IC in damage. From every -0.1 IC that the city took in damage, it will get +0.04 in repairs after a year, and another +0.04 after 5 years. The remaining 0.02</w:t>
-      </w:r>
-      <w:r>
-        <w:t xml:space="preserve"> IC</w:t>
-      </w:r>
-      <w:r>
-        <w:t xml:space="preserve"> will not be repaired.</w:t>
-      </w:r>
-    </w:p>
-    <w:p/>
-    <w:p>
-      <w:pPr>
-        <w:rPr>
-          <w:b/>
-          <w:bCs/>
-        </w:rPr>
-      </w:pPr>
-      <w:r>
-        <w:rPr>
-          <w:b/>
-          <w:bCs/>
-        </w:rPr>
-        <w:t>AI auto-invasions</w:t>
-      </w:r>
-    </w:p>
-    <w:p>
-      <w:r>
-        <w:rPr>
-          <w:b/>
-        </w:rPr>
-        <w:t>The what</w:t>
-      </w:r>
-      <w:r>
-        <w:t xml:space="preserve">: There are events to help AI launch main historical amphibious invasions for Germany, Japan, and US/UK. While it </w:t>
-      </w:r>
-      <w:r>
-        <w:rPr>
-          <w:u w:val="single"/>
-        </w:rPr>
-        <w:t>is</w:t>
-      </w:r>
-      <w:r>
-        <w:t xml:space="preserve"> </w:t>
-      </w:r>
-      <w:r>
-        <w:t xml:space="preserve">obviously </w:t>
-      </w:r>
-      <w:r>
-        <w:t xml:space="preserve">an AI cheat, the units themselves are not free. The AI will </w:t>
-      </w:r>
-      <w:r>
-        <w:rPr>
-          <w:u w:val="single"/>
-        </w:rPr>
-        <w:t>always</w:t>
-      </w:r>
-      <w:r>
-        <w:t xml:space="preserve"> lose as many divisions as it</w:t>
-      </w:r>
-      <w:r>
-        <w:t xml:space="preserve"> appears to</w:t>
-      </w:r>
-      <w:r>
-        <w:t xml:space="preserve"> </w:t>
-      </w:r>
-      <w:r>
-        <w:t>“</w:t>
-      </w:r>
-      <w:r>
-        <w:t>gain” in the invasion</w:t>
-      </w:r>
-      <w:r>
-        <w:t>, ideally, of the same exact name and type. Effectively, the goal of the cheat is to simply “teleport”</w:t>
-      </w:r>
-      <w:r>
-        <w:t xml:space="preserve"> existing</w:t>
-      </w:r>
-      <w:r>
-        <w:t xml:space="preserve"> divisions to the desired location</w:t>
-      </w:r>
-      <w:r>
-        <w:t>, but without giving the AI anything for free</w:t>
-      </w:r>
-      <w:r>
-        <w:t>.</w:t>
-      </w:r>
-    </w:p>
-    <w:p>
-      <w:r>
-        <w:rPr>
-          <w:b/>
-        </w:rPr>
-        <w:t>The why</w:t>
-      </w:r>
-      <w:r>
-        <w:t>: AI in general is very bad in DH,</w:t>
-      </w:r>
-      <w:r>
-        <w:t xml:space="preserve"> but</w:t>
-      </w:r>
-      <w:r>
-        <w:t xml:space="preserve"> the invasion AI is perhaps among the worst. Many if not most historical invasions, especially by the Axis, relied heavily upon scale and speed, which the native invasion AI will never be able to replicate on its own. It will typically take weeks to months to prepare an invasion, it will launch it with at most a few divisions, often </w:t>
-      </w:r>
-      <w:r>
-        <w:t>choosing divisions in a very suboptimal way that is</w:t>
-      </w:r>
-      <w:r>
-        <w:t xml:space="preserve"> less than ideal for the task, and even if by some miracle it succeeds at </w:t>
-      </w:r>
-      <w:r>
+        <w:t>: Manual puppet release is currently disabled and probably won’t be re-enabled. Existing puppets and puppets released by events are not all the same – they are categorized into 10 tiers based on their level of sovereignty and self-reliance. The strongest puppets will be almost indistinguishable from independent states. The weakest puppets, on the other hand, will have a high minimum dissent level which they can’t get rid of, affecting their industry, revolt risk, and combat performance of their troops. Weak puppets also cannot enact mobilization, and every once in a while, they will have an attempted coup. If the coup fails, they will just have a further dissent spike and spawn</w:t>
+      </w:r>
+      <w:r>
+        <w:t xml:space="preserve"> rebels</w:t>
+      </w:r>
+      <w:r>
+        <w:t xml:space="preserve"> in a bunch of provinces. But if the coup succeeds… The whole puppet will defect together with its entire existing army plus additional troops and militia.</w:t>
+      </w:r>
+    </w:p>
+    <w:p>
+      <w:r>
+        <w:rPr>
+          <w:b/>
+        </w:rPr>
         <w:lastRenderedPageBreak/>
-        <w:t>establishing a beachhead, it will be at loss how to exploit it and will usually get kicked out within a week if the enemy has any army at all to contest the landing.</w:t>
-      </w:r>
-      <w:r>
-        <w:t xml:space="preserve"> And at any point during this process, a about a million things can go wrong where the AI just ends up cancelling the invasion altogether of bungling it up completely. </w:t>
-      </w:r>
-      <w:r>
-        <w:t xml:space="preserve"> With that in mind, </w:t>
-      </w:r>
-      <w:r>
-        <w:t>I felt like a few event-driven invasions were required to at least cover the base historical invasion scenarios.</w:t>
-      </w:r>
-    </w:p>
-    <w:p/>
-    <w:p>
-      <w:pPr>
-        <w:rPr>
-          <w:b/>
-          <w:bCs/>
-        </w:rPr>
-      </w:pPr>
-      <w:r>
-        <w:rPr>
-          <w:b/>
-          <w:bCs/>
-        </w:rPr>
-        <w:t>Puppets</w:t>
-      </w:r>
-    </w:p>
-    <w:p>
-      <w:r>
-        <w:rPr>
-          <w:b/>
-        </w:rPr>
-        <w:t>The what</w:t>
-      </w:r>
-      <w:r>
-        <w:t>: Manual puppet release is currently disabled and probably won’t be re-enabled. Existing puppets and puppets released by events are not all the same – they are categorized into 10 tiers based on their level of sovereignty and self-reliance. The strongest puppets will be almost indistinguishable from independent states. The weakest puppets, on the other hand, will have a high minimum dissent level which they can’t get rid of, affecting their industry, revolt risk, and combat performance of their troops. Weak puppets also cannot enact mobilization, and every once in a while, they will have an attempted coup. If the coup fails, they will just have a further dissent spike and spawn</w:t>
-      </w:r>
-      <w:r>
-        <w:t xml:space="preserve"> rebels</w:t>
-      </w:r>
-      <w:r>
-        <w:t xml:space="preserve"> in a bunch of provinces. But if the coup succeeds… The whole puppet will defect together with its entire existing army plus additional troops and militia.</w:t>
-      </w:r>
-    </w:p>
-    <w:p>
-      <w:r>
-        <w:rPr>
-          <w:b/>
-        </w:rPr>
         <w:t>The why</w:t>
       </w:r>
       <w:r>
@@ -4698,6 +4811,92 @@
     </w:lvl>
   </w:abstractNum>
   <w:abstractNum w:abstractNumId="4" w15:restartNumberingAfterBreak="0">
+    <w:nsid w:val="241E46F4"/>
+    <w:multiLevelType w:val="hybridMultilevel"/>
+    <w:tmpl w:val="91444FA2"/>
+    <w:lvl w:ilvl="0" w:tplc="04090019">
+      <w:start w:val="1"/>
+      <w:numFmt w:val="lowerLetter"/>
+      <w:lvlText w:val="%1."/>
+      <w:lvlJc w:val="left"/>
+      <w:pPr>
+        <w:ind w:left="360" w:hanging="360"/>
+      </w:pPr>
+    </w:lvl>
+    <w:lvl w:ilvl="1" w:tplc="04090019" w:tentative="1">
+      <w:start w:val="1"/>
+      <w:numFmt w:val="lowerLetter"/>
+      <w:lvlText w:val="%2."/>
+      <w:lvlJc w:val="left"/>
+      <w:pPr>
+        <w:ind w:left="1080" w:hanging="360"/>
+      </w:pPr>
+    </w:lvl>
+    <w:lvl w:ilvl="2" w:tplc="0409001B" w:tentative="1">
+      <w:start w:val="1"/>
+      <w:numFmt w:val="lowerRoman"/>
+      <w:lvlText w:val="%3."/>
+      <w:lvlJc w:val="right"/>
+      <w:pPr>
+        <w:ind w:left="1800" w:hanging="180"/>
+      </w:pPr>
+    </w:lvl>
+    <w:lvl w:ilvl="3" w:tplc="0409000F" w:tentative="1">
+      <w:start w:val="1"/>
+      <w:numFmt w:val="decimal"/>
+      <w:lvlText w:val="%4."/>
+      <w:lvlJc w:val="left"/>
+      <w:pPr>
+        <w:ind w:left="2520" w:hanging="360"/>
+      </w:pPr>
+    </w:lvl>
+    <w:lvl w:ilvl="4" w:tplc="04090019" w:tentative="1">
+      <w:start w:val="1"/>
+      <w:numFmt w:val="lowerLetter"/>
+      <w:lvlText w:val="%5."/>
+      <w:lvlJc w:val="left"/>
+      <w:pPr>
+        <w:ind w:left="3240" w:hanging="360"/>
+      </w:pPr>
+    </w:lvl>
+    <w:lvl w:ilvl="5" w:tplc="0409001B" w:tentative="1">
+      <w:start w:val="1"/>
+      <w:numFmt w:val="lowerRoman"/>
+      <w:lvlText w:val="%6."/>
+      <w:lvlJc w:val="right"/>
+      <w:pPr>
+        <w:ind w:left="3960" w:hanging="180"/>
+      </w:pPr>
+    </w:lvl>
+    <w:lvl w:ilvl="6" w:tplc="0409000F" w:tentative="1">
+      <w:start w:val="1"/>
+      <w:numFmt w:val="decimal"/>
+      <w:lvlText w:val="%7."/>
+      <w:lvlJc w:val="left"/>
+      <w:pPr>
+        <w:ind w:left="4680" w:hanging="360"/>
+      </w:pPr>
+    </w:lvl>
+    <w:lvl w:ilvl="7" w:tplc="04090019" w:tentative="1">
+      <w:start w:val="1"/>
+      <w:numFmt w:val="lowerLetter"/>
+      <w:lvlText w:val="%8."/>
+      <w:lvlJc w:val="left"/>
+      <w:pPr>
+        <w:ind w:left="5400" w:hanging="360"/>
+      </w:pPr>
+    </w:lvl>
+    <w:lvl w:ilvl="8" w:tplc="0409001B" w:tentative="1">
+      <w:start w:val="1"/>
+      <w:numFmt w:val="lowerRoman"/>
+      <w:lvlText w:val="%9."/>
+      <w:lvlJc w:val="right"/>
+      <w:pPr>
+        <w:ind w:left="6120" w:hanging="180"/>
+      </w:pPr>
+    </w:lvl>
+  </w:abstractNum>
+  <w:abstractNum w:abstractNumId="5" w15:restartNumberingAfterBreak="0">
     <w:nsid w:val="2D0856F3"/>
     <w:multiLevelType w:val="hybridMultilevel"/>
     <w:tmpl w:val="E430A606"/>
@@ -4786,7 +4985,7 @@
       </w:pPr>
     </w:lvl>
   </w:abstractNum>
-  <w:abstractNum w:abstractNumId="5" w15:restartNumberingAfterBreak="0">
+  <w:abstractNum w:abstractNumId="6" w15:restartNumberingAfterBreak="0">
     <w:nsid w:val="3CBB05F4"/>
     <w:multiLevelType w:val="hybridMultilevel"/>
     <w:tmpl w:val="087A8036"/>
@@ -4899,7 +5098,7 @@
       </w:rPr>
     </w:lvl>
   </w:abstractNum>
-  <w:abstractNum w:abstractNumId="6" w15:restartNumberingAfterBreak="0">
+  <w:abstractNum w:abstractNumId="7" w15:restartNumberingAfterBreak="0">
     <w:nsid w:val="6CEC660A"/>
     <w:multiLevelType w:val="hybridMultilevel"/>
     <w:tmpl w:val="C5DAC712"/>
@@ -5025,13 +5224,16 @@
     <w:abstractNumId w:val="1"/>
   </w:num>
   <w:num w:numId="5" w16cid:durableId="1473596599">
+    <w:abstractNumId w:val="7"/>
+  </w:num>
+  <w:num w:numId="6" w16cid:durableId="170533786">
+    <w:abstractNumId w:val="5"/>
+  </w:num>
+  <w:num w:numId="7" w16cid:durableId="1926456980">
     <w:abstractNumId w:val="6"/>
   </w:num>
-  <w:num w:numId="6" w16cid:durableId="170533786">
+  <w:num w:numId="8" w16cid:durableId="165438411">
     <w:abstractNumId w:val="4"/>
-  </w:num>
-  <w:num w:numId="7" w16cid:durableId="1926456980">
-    <w:abstractNumId w:val="5"/>
   </w:num>
 </w:numbering>
 </file>

</xml_diff>